<commit_message>
Add registration payment flow
</commit_message>
<xml_diff>
--- a/docs/Smart_Sportz_API_Master_Internal_External_API_Specification.docx
+++ b/docs/Smart_Sportz_API_Master_Internal_External_API_Specification.docx
@@ -263,7 +263,7 @@
                 <w:color w:val="auto"/>
                 <w:rFonts w:ascii="Times New Roman" w:hAnsi="Times New Roman" w:cs="Times New Roman"/>
               </w:rPr>
-              <w:t>Node.js, Express, Socket.IO, PostgreSQL, Prisma, Redis, service layer, repository pattern, middleware, validation, caching, audit logs</w:t>
+              <w:t>Production target: Node.js, Express, Socket.IO, PostgreSQL, Prisma, Redis, service layer, repository pattern, middleware, validation, caching, audit logs. Current local implementation: Python FastAPI with SQLite/local storage until external providers are connected.</w:t>
             </w:r>
           </w:p>
         </w:tc>
@@ -413,7 +413,7 @@
                 <w:color w:val="auto"/>
                 <w:rFonts w:ascii="Times New Roman" w:hAnsi="Times New Roman" w:cs="Times New Roman"/>
               </w:rPr>
-              <w:t>July 5, 2026</w:t>
+              <w:t>July 24, 2026</w:t>
             </w:r>
           </w:p>
         </w:tc>
@@ -463,7 +463,7 @@
                 <w:color w:val="auto"/>
                 <w:rFonts w:ascii="Times New Roman" w:hAnsi="Times New Roman" w:cs="Times New Roman"/>
               </w:rPr>
-              <w:t>1.0</w:t>
+              <w:t>1.1</w:t>
             </w:r>
           </w:p>
         </w:tc>
@@ -3133,7 +3133,7 @@
                 <w:color w:val="auto"/>
                 <w:rFonts w:ascii="Times New Roman" w:hAnsi="Times New Roman" w:cs="Times New Roman"/>
               </w:rPr>
-              <w:t>GET/POST /tournaments, GET/PATCH/DELETE /tournaments/:id, POST /tournaments/:id/publish, POST /tournaments/:id/fixtures/generate, GET /tournaments/:id/brackets</w:t>
+              <w:t>GET/POST /tournaments, GET/PATCH/DELETE /tournaments/:id, PATCH /management/tournaments/:slug/team-size, POST /tournaments/:id/publish, POST /tournaments/:id/fixtures/generate, GET /public/tournaments/:slug/bracket</w:t>
             </w:r>
           </w:p>
         </w:tc>
@@ -3183,7 +3183,7 @@
                 <w:color w:val="auto"/>
                 <w:rFonts w:ascii="Times New Roman" w:hAnsi="Times New Roman" w:cs="Times New Roman"/>
               </w:rPr>
-              <w:t>POST /registrations/team, POST /registrations/player, POST /registrations/:id/documents, PATCH /registrations/:id/approve, PATCH /registrations/:id/reject, GET /registrations/status/:code</w:t>
+              <w:t>POST /registrations/team or POST /registrations, POST /registrations/player, POST /registrations/:id/documents, PATCH /management/registrations/:id/approve, PATCH /management/registrations/:id/reject, GET /registrations/status/:code</w:t>
             </w:r>
           </w:p>
         </w:tc>
@@ -3409,6 +3409,56 @@
                 <w:color w:val="auto"/>
                 <w:rFonts w:ascii="Times New Roman" w:hAnsi="Times New Roman" w:cs="Times New Roman"/>
               </w:rPr>
+              <w:t>Bracket and Rounds</w:t>
+            </w:r>
+          </w:p>
+        </w:tc>
+        <w:tc>
+          <w:tcPr>
+            <w:tcW w:w="7160" w:type="dxa"/>
+            <w:tcMar>
+              <w:top w:w="100" w:type="dxa"/>
+              <w:left w:w="120" w:type="dxa"/>
+              <w:bottom w:w="100" w:type="dxa"/>
+              <w:right w:w="120" w:type="dxa"/>
+            </w:tcMar>
+            <w:vAlign w:val="center"/>
+          </w:tcPr>
+          <w:p>
+            <w:pPr>
+              <w:spacing w:after="0"/>
+            </w:pPr>
+            <w:r>
+              <w:rPr>
+                <w:color w:val="auto"/>
+                <w:rFonts w:ascii="Times New Roman" w:hAnsi="Times New Roman" w:cs="Times New Roman"/>
+              </w:rPr>
+              <w:t>GET /public/tournaments/:slug/bracket, GET /management/brackets/:tournamentSlug, POST /management/brackets/:tournamentSlug/save, POST /management/brackets/:tournamentSlug/advance-winner, POST /management/brackets/:tournamentSlug/notify</w:t>
+            </w:r>
+          </w:p>
+        </w:tc>
+      </w:tr>
+      <w:tr>
+        <w:tc>
+          <w:tcPr>
+            <w:tcW w:w="2200" w:type="dxa"/>
+            <w:tcMar>
+              <w:top w:w="100" w:type="dxa"/>
+              <w:left w:w="120" w:type="dxa"/>
+              <w:bottom w:w="100" w:type="dxa"/>
+              <w:right w:w="120" w:type="dxa"/>
+            </w:tcMar>
+            <w:vAlign w:val="center"/>
+          </w:tcPr>
+          <w:p>
+            <w:pPr>
+              <w:spacing w:after="0"/>
+            </w:pPr>
+            <w:r>
+              <w:rPr>
+                <w:color w:val="auto"/>
+                <w:rFonts w:ascii="Times New Roman" w:hAnsi="Times New Roman" w:cs="Times New Roman"/>
+              </w:rPr>
               <w:t>Notifications</w:t>
             </w:r>
           </w:p>
@@ -3433,7 +3483,7 @@
                 <w:color w:val="auto"/>
                 <w:rFonts w:ascii="Times New Roman" w:hAnsi="Times New Roman" w:cs="Times New Roman"/>
               </w:rPr>
-              <w:t>POST /notifications/send, GET/POST /notifications/templates, GET /notifications/logs, POST /notifications/test</w:t>
+              <w:t>POST /notifications/send, POST /management/brackets/:tournamentSlug/notify, GET/POST /notifications/templates, GET /notifications/logs, POST /notifications/test</w:t>
             </w:r>
           </w:p>
         </w:tc>
@@ -3720,7 +3770,7 @@
                 <w:color w:val="auto"/>
                 <w:rFonts w:ascii="Times New Roman" w:hAnsi="Times New Roman" w:cs="Times New Roman"/>
               </w:rPr>
-              <w:t>GET /public/tournaments?status=&amp;sport=&amp;search=&amp;page=, GET /public/sports, GET /public/venues</w:t>
+              <w:t>GET /public/tournaments?status=&amp;sport=&amp;search=&amp;page=, GET /public/sports, GET /public/sports/:slug, GET /public/venues</w:t>
             </w:r>
           </w:p>
         </w:tc>
@@ -3770,7 +3820,7 @@
                 <w:color w:val="auto"/>
                 <w:rFonts w:ascii="Times New Roman" w:hAnsi="Times New Roman" w:cs="Times New Roman"/>
               </w:rPr>
-              <w:t>GET /public/tournaments/:slug, GET /public/tournaments/:id/fixtures, GET /public/tournaments/:id/standings, GET /public/tournaments/:id/gallery</w:t>
+              <w:t>GET /public/tournaments/:slug, GET /public/tournaments/:slug/bracket, GET /public/tournaments/:id/fixtures, GET /public/tournaments/:id/standings, GET /public/tournaments/:id/gallery</w:t>
             </w:r>
           </w:p>
         </w:tc>
@@ -3796,6 +3846,56 @@
                 <w:color w:val="auto"/>
                 <w:rFonts w:ascii="Times New Roman" w:hAnsi="Times New Roman" w:cs="Times New Roman"/>
               </w:rPr>
+              <w:t>Sport Tournament Page</w:t>
+            </w:r>
+          </w:p>
+        </w:tc>
+        <w:tc>
+          <w:tcPr>
+            <w:tcW w:w="7060" w:type="dxa"/>
+            <w:tcMar>
+              <w:top w:w="100" w:type="dxa"/>
+              <w:left w:w="120" w:type="dxa"/>
+              <w:bottom w:w="100" w:type="dxa"/>
+              <w:right w:w="120" w:type="dxa"/>
+            </w:tcMar>
+            <w:vAlign w:val="center"/>
+          </w:tcPr>
+          <w:p>
+            <w:pPr>
+              <w:spacing w:after="0"/>
+            </w:pPr>
+            <w:r>
+              <w:rPr>
+                <w:color w:val="auto"/>
+                <w:rFonts w:ascii="Times New Roman" w:hAnsi="Times New Roman" w:cs="Times New Roman"/>
+              </w:rPr>
+              <w:t>GET /public/sports/:slug returns only selected sport tournaments grouped as upcoming, live, and existing/completed. Do not mix all-sport tournaments on selected sport pages.</w:t>
+            </w:r>
+          </w:p>
+        </w:tc>
+      </w:tr>
+      <w:tr>
+        <w:tc>
+          <w:tcPr>
+            <w:tcW w:w="2300" w:type="dxa"/>
+            <w:tcMar>
+              <w:top w:w="100" w:type="dxa"/>
+              <w:left w:w="120" w:type="dxa"/>
+              <w:bottom w:w="100" w:type="dxa"/>
+              <w:right w:w="120" w:type="dxa"/>
+            </w:tcMar>
+            <w:vAlign w:val="center"/>
+          </w:tcPr>
+          <w:p>
+            <w:pPr>
+              <w:spacing w:after="0"/>
+            </w:pPr>
+            <w:r>
+              <w:rPr>
+                <w:color w:val="auto"/>
+                <w:rFonts w:ascii="Times New Roman" w:hAnsi="Times New Roman" w:cs="Times New Roman"/>
+              </w:rPr>
               <w:t>Registration Form</w:t>
             </w:r>
           </w:p>
@@ -3820,7 +3920,7 @@
                 <w:color w:val="auto"/>
                 <w:rFonts w:ascii="Times New Roman" w:hAnsi="Times New Roman" w:cs="Times New Roman"/>
               </w:rPr>
-              <w:t>POST /registrations/team, POST /registrations/player, POST /registrations/:id/documents, GET /registrations/status/:code</w:t>
+              <w:t>GET /public/tournaments/:slug for team_size, POST /registrations or /registrations/team with members[] exactly matching tournament team_size, POST /registrations/:id/documents, GET /registrations/status/:code</w:t>
             </w:r>
           </w:p>
         </w:tc>
@@ -4070,7 +4170,7 @@
                 <w:color w:val="auto"/>
                 <w:rFonts w:ascii="Times New Roman" w:hAnsi="Times New Roman" w:cs="Times New Roman"/>
               </w:rPr>
-              <w:t>GET/POST/PATCH /tournaments, POST /tournaments/:id/fixtures/generate, POST /tournaments/:id/publish, GET /tournaments/:id/brackets</w:t>
+              <w:t>GET/POST/PATCH /tournaments, PATCH /management/tournaments/:slug/team-size, POST /tournaments/:id/fixtures/generate, POST /tournaments/:id/publish, GET /public/tournaments/:slug/bracket</w:t>
             </w:r>
           </w:p>
         </w:tc>
@@ -4171,6 +4271,156 @@
                 <w:rFonts w:ascii="Times New Roman" w:hAnsi="Times New Roman" w:cs="Times New Roman"/>
               </w:rPr>
               <w:t>GET /management/dashboard, GET /management/tournaments/:id/overview, GET /matches/live, GET /registrations?status=pending</w:t>
+            </w:r>
+          </w:p>
+        </w:tc>
+      </w:tr>
+      <w:tr>
+        <w:tc>
+          <w:tcPr>
+            <w:tcW w:w="2300" w:type="dxa"/>
+            <w:tcMar>
+              <w:top w:w="100" w:type="dxa"/>
+              <w:left w:w="120" w:type="dxa"/>
+              <w:bottom w:w="100" w:type="dxa"/>
+              <w:right w:w="120" w:type="dxa"/>
+            </w:tcMar>
+            <w:vAlign w:val="center"/>
+          </w:tcPr>
+          <w:p>
+            <w:pPr>
+              <w:spacing w:after="0"/>
+            </w:pPr>
+            <w:r>
+              <w:rPr>
+                <w:color w:val="auto"/>
+                <w:rFonts w:ascii="Times New Roman" w:hAnsi="Times New Roman" w:cs="Times New Roman"/>
+              </w:rPr>
+              <w:t>Management Registration Approval</w:t>
+            </w:r>
+          </w:p>
+        </w:tc>
+        <w:tc>
+          <w:tcPr>
+            <w:tcW w:w="7060" w:type="dxa"/>
+            <w:tcMar>
+              <w:top w:w="100" w:type="dxa"/>
+              <w:left w:w="120" w:type="dxa"/>
+              <w:bottom w:w="100" w:type="dxa"/>
+              <w:right w:w="120" w:type="dxa"/>
+            </w:tcMar>
+            <w:vAlign w:val="center"/>
+          </w:tcPr>
+          <w:p>
+            <w:pPr>
+              <w:spacing w:after="0"/>
+            </w:pPr>
+            <w:r>
+              <w:rPr>
+                <w:color w:val="auto"/>
+                <w:rFonts w:ascii="Times New Roman" w:hAnsi="Times New Roman" w:cs="Times New Roman"/>
+              </w:rPr>
+              <w:t>POST /management/registrations/:registrationId/approve, POST /management/registrations/:registrationId/reject. Accepted teams feed bracket allocation.</w:t>
+            </w:r>
+          </w:p>
+        </w:tc>
+      </w:tr>
+      <w:tr>
+        <w:tc>
+          <w:tcPr>
+            <w:tcW w:w="2300" w:type="dxa"/>
+            <w:tcMar>
+              <w:top w:w="100" w:type="dxa"/>
+              <w:left w:w="120" w:type="dxa"/>
+              <w:bottom w:w="100" w:type="dxa"/>
+              <w:right w:w="120" w:type="dxa"/>
+            </w:tcMar>
+            <w:vAlign w:val="center"/>
+          </w:tcPr>
+          <w:p>
+            <w:pPr>
+              <w:spacing w:after="0"/>
+            </w:pPr>
+            <w:r>
+              <w:rPr>
+                <w:color w:val="auto"/>
+                <w:rFonts w:ascii="Times New Roman" w:hAnsi="Times New Roman" w:cs="Times New Roman"/>
+              </w:rPr>
+              <w:t>Manager Bracket Allocation Workspace</w:t>
+            </w:r>
+          </w:p>
+        </w:tc>
+        <w:tc>
+          <w:tcPr>
+            <w:tcW w:w="7060" w:type="dxa"/>
+            <w:tcMar>
+              <w:top w:w="100" w:type="dxa"/>
+              <w:left w:w="120" w:type="dxa"/>
+              <w:bottom w:w="100" w:type="dxa"/>
+              <w:right w:w="120" w:type="dxa"/>
+            </w:tcMar>
+            <w:vAlign w:val="center"/>
+          </w:tcPr>
+          <w:p>
+            <w:pPr>
+              <w:spacing w:after="0"/>
+            </w:pPr>
+            <w:r>
+              <w:rPr>
+                <w:color w:val="auto"/>
+                <w:rFonts w:ascii="Times New Roman" w:hAnsi="Times New Roman" w:cs="Times New Roman"/>
+              </w:rPr>
+              <w:t>GET /management/brackets/:tournamentSlug, POST /management/brackets/:tournamentSlug/save, POST /management/brackets/:tournamentSlug/advance-winner, POST /management/brackets/:tournamentSlug/notify</w:t>
+            </w:r>
+          </w:p>
+        </w:tc>
+      </w:tr>
+      <w:tr>
+        <w:tc>
+          <w:tcPr>
+            <w:tcW w:w="2300" w:type="dxa"/>
+            <w:tcMar>
+              <w:top w:w="100" w:type="dxa"/>
+              <w:left w:w="120" w:type="dxa"/>
+              <w:bottom w:w="100" w:type="dxa"/>
+              <w:right w:w="120" w:type="dxa"/>
+            </w:tcMar>
+            <w:vAlign w:val="center"/>
+          </w:tcPr>
+          <w:p>
+            <w:pPr>
+              <w:spacing w:after="0"/>
+            </w:pPr>
+            <w:r>
+              <w:rPr>
+                <w:color w:val="auto"/>
+                <w:rFonts w:ascii="Times New Roman" w:hAnsi="Times New Roman" w:cs="Times New Roman"/>
+              </w:rPr>
+              <w:t>Public/User Rounds Viewer</w:t>
+            </w:r>
+          </w:p>
+        </w:tc>
+        <w:tc>
+          <w:tcPr>
+            <w:tcW w:w="7060" w:type="dxa"/>
+            <w:tcMar>
+              <w:top w:w="100" w:type="dxa"/>
+              <w:left w:w="120" w:type="dxa"/>
+              <w:bottom w:w="100" w:type="dxa"/>
+              <w:right w:w="120" w:type="dxa"/>
+            </w:tcMar>
+            <w:vAlign w:val="center"/>
+          </w:tcPr>
+          <w:p>
+            <w:pPr>
+              <w:spacing w:after="0"/>
+            </w:pPr>
+            <w:r>
+              <w:rPr>
+                <w:color w:val="auto"/>
+                <w:rFonts w:ascii="Times New Roman" w:hAnsi="Times New Roman" w:cs="Times New Roman"/>
+              </w:rPr>
+              <w:t>GET /public/tournaments/:slug/bracket. Upcoming tournaments show locked blank round circles and connector lines only; live/existing tournaments show published team progression and score details.</w:t>
             </w:r>
           </w:p>
         </w:tc>
@@ -4657,7 +4907,7 @@
                 <w:color w:val="auto"/>
                 <w:rFonts w:ascii="Times New Roman" w:hAnsi="Times New Roman" w:cs="Times New Roman"/>
               </w:rPr>
-              <w:t>POST /registrations/team -&gt; validate roster -&gt; upload documents -&gt; pending approval -&gt; notify manager.</w:t>
+              <w:t>GET /public/tournaments/:slug -&gt; read team_size -&gt; POST /registrations/team or POST /registrations with members[] -&gt; validate exact roster count including captain/sub-captain -&gt; upload documents -&gt; pending approval -&gt; notify manager.</w:t>
             </w:r>
           </w:p>
         </w:tc>
@@ -4858,6 +5108,156 @@
                 <w:rFonts w:ascii="Times New Roman" w:hAnsi="Times New Roman" w:cs="Times New Roman"/>
               </w:rPr>
               <w:t>POST /matches/:id/events -&gt; DB-1 match event -&gt; Redis active state -&gt; Socket.IO broadcast -&gt; DB-3 operator audit.</w:t>
+            </w:r>
+          </w:p>
+        </w:tc>
+      </w:tr>
+      <w:tr>
+        <w:tc>
+          <w:tcPr>
+            <w:tcW w:w="2300" w:type="dxa"/>
+            <w:tcMar>
+              <w:top w:w="100" w:type="dxa"/>
+              <w:left w:w="120" w:type="dxa"/>
+              <w:bottom w:w="100" w:type="dxa"/>
+              <w:right w:w="120" w:type="dxa"/>
+            </w:tcMar>
+            <w:vAlign w:val="center"/>
+          </w:tcPr>
+          <w:p>
+            <w:pPr>
+              <w:spacing w:after="0"/>
+            </w:pPr>
+            <w:r>
+              <w:rPr>
+                <w:color w:val="auto"/>
+                <w:rFonts w:ascii="Times New Roman" w:hAnsi="Times New Roman" w:cs="Times New Roman"/>
+              </w:rPr>
+              <w:t>Bracket Allocation</w:t>
+            </w:r>
+          </w:p>
+        </w:tc>
+        <w:tc>
+          <w:tcPr>
+            <w:tcW w:w="7060" w:type="dxa"/>
+            <w:tcMar>
+              <w:top w:w="100" w:type="dxa"/>
+              <w:left w:w="120" w:type="dxa"/>
+              <w:bottom w:w="100" w:type="dxa"/>
+              <w:right w:w="120" w:type="dxa"/>
+            </w:tcMar>
+            <w:vAlign w:val="center"/>
+          </w:tcPr>
+          <w:p>
+            <w:pPr>
+              <w:spacing w:after="0"/>
+            </w:pPr>
+            <w:r>
+              <w:rPr>
+                <w:color w:val="auto"/>
+                <w:rFonts w:ascii="Times New Roman" w:hAnsi="Times New Roman" w:cs="Times New Roman"/>
+              </w:rPr>
+              <w:t>POST /management/registrations/:id/approve -&gt; accepted team appears in bracket workspace -&gt; GET /management/brackets/:slug -&gt; manager edits nodes/connections -&gt; POST /management/brackets/:slug/save -&gt; public bracket updates.</w:t>
+            </w:r>
+          </w:p>
+        </w:tc>
+      </w:tr>
+      <w:tr>
+        <w:tc>
+          <w:tcPr>
+            <w:tcW w:w="2300" w:type="dxa"/>
+            <w:tcMar>
+              <w:top w:w="100" w:type="dxa"/>
+              <w:left w:w="120" w:type="dxa"/>
+              <w:bottom w:w="100" w:type="dxa"/>
+              <w:right w:w="120" w:type="dxa"/>
+            </w:tcMar>
+            <w:vAlign w:val="center"/>
+          </w:tcPr>
+          <w:p>
+            <w:pPr>
+              <w:spacing w:after="0"/>
+            </w:pPr>
+            <w:r>
+              <w:rPr>
+                <w:color w:val="auto"/>
+                <w:rFonts w:ascii="Times New Roman" w:hAnsi="Times New Roman" w:cs="Times New Roman"/>
+              </w:rPr>
+              <w:t>Winner Progression</w:t>
+            </w:r>
+          </w:p>
+        </w:tc>
+        <w:tc>
+          <w:tcPr>
+            <w:tcW w:w="7060" w:type="dxa"/>
+            <w:tcMar>
+              <w:top w:w="100" w:type="dxa"/>
+              <w:left w:w="120" w:type="dxa"/>
+              <w:bottom w:w="100" w:type="dxa"/>
+              <w:right w:w="120" w:type="dxa"/>
+            </w:tcMar>
+            <w:vAlign w:val="center"/>
+          </w:tcPr>
+          <w:p>
+            <w:pPr>
+              <w:spacing w:after="0"/>
+            </w:pPr>
+            <w:r>
+              <w:rPr>
+                <w:color w:val="auto"/>
+                <w:rFonts w:ascii="Times New Roman" w:hAnsi="Times New Roman" w:cs="Times New Roman"/>
+              </w:rPr>
+              <w:t>PATCH /matches/:id/score or POST /matches/:id/events -&gt; result calculation -&gt; POST /management/brackets/:slug/advance-winner when approved -&gt; next round node updated -&gt; public rounds viewer refreshes.</w:t>
+            </w:r>
+          </w:p>
+        </w:tc>
+      </w:tr>
+      <w:tr>
+        <w:tc>
+          <w:tcPr>
+            <w:tcW w:w="2300" w:type="dxa"/>
+            <w:tcMar>
+              <w:top w:w="100" w:type="dxa"/>
+              <w:left w:w="120" w:type="dxa"/>
+              <w:bottom w:w="100" w:type="dxa"/>
+              <w:right w:w="120" w:type="dxa"/>
+            </w:tcMar>
+            <w:vAlign w:val="center"/>
+          </w:tcPr>
+          <w:p>
+            <w:pPr>
+              <w:spacing w:after="0"/>
+            </w:pPr>
+            <w:r>
+              <w:rPr>
+                <w:color w:val="auto"/>
+                <w:rFonts w:ascii="Times New Roman" w:hAnsi="Times New Roman" w:cs="Times New Roman"/>
+              </w:rPr>
+              <w:t>Manual Bracket Notification</w:t>
+            </w:r>
+          </w:p>
+        </w:tc>
+        <w:tc>
+          <w:tcPr>
+            <w:tcW w:w="7060" w:type="dxa"/>
+            <w:tcMar>
+              <w:top w:w="100" w:type="dxa"/>
+              <w:left w:w="120" w:type="dxa"/>
+              <w:bottom w:w="100" w:type="dxa"/>
+              <w:right w:w="120" w:type="dxa"/>
+            </w:tcMar>
+            <w:vAlign w:val="center"/>
+          </w:tcPr>
+          <w:p>
+            <w:pPr>
+              <w:spacing w:after="0"/>
+            </w:pPr>
+            <w:r>
+              <w:rPr>
+                <w:color w:val="auto"/>
+                <w:rFonts w:ascii="Times New Roman" w:hAnsi="Times New Roman" w:cs="Times New Roman"/>
+              </w:rPr>
+              <w:t>POST /management/brackets/:slug/notify with channels sms/email/both -&gt; local notification event now, external SMS/email provider later.</w:t>
             </w:r>
           </w:p>
         </w:tc>
@@ -4872,7 +5272,1311 @@
           <w:color w:val="auto"/>
           <w:rFonts w:ascii="Times New Roman" w:hAnsi="Times New Roman" w:cs="Times New Roman"/>
         </w:rPr>
-        <w:t>10. Socket.IO Event Contract</w:t>
+        <w:t>10. Sport-Specific Tournament, Registration Member, and Bracket APIs</w:t>
+      </w:r>
+    </w:p>
+    <w:p>
+      <w:r>
+        <w:rPr>
+          <w:color w:val="auto"/>
+          <w:rFonts w:ascii="Times New Roman" w:hAnsi="Times New Roman" w:cs="Times New Roman"/>
+        </w:rPr>
+        <w:t>This section records the new frontend/backend update: selected sport pages show only that sport, upcoming public rounds show clean locked bracket circles with connector lines, and management users control accepted teams through a bracket workspace. Current local backend uses Python FastAPI and SQLite/local storage; production can map the same contracts to Node/Express/PostgreSQL.</w:t>
+      </w:r>
+    </w:p>
+    <w:tbl>
+      <w:tblPr>
+        <w:tblW w:w="9360" w:type="dxa"/>
+        <w:tblInd w:w="120" w:type="dxa"/>
+        <w:tblLayout w:type="fixed"/>
+        <w:tblBorders>
+          <w:top w:val="single" w:sz="4" w:space="0" w:color="000000"/>
+          <w:left w:val="single" w:sz="4" w:space="0" w:color="000000"/>
+          <w:bottom w:val="single" w:sz="4" w:space="0" w:color="000000"/>
+          <w:right w:val="single" w:sz="4" w:space="0" w:color="000000"/>
+          <w:insideH w:val="single" w:sz="4" w:space="0" w:color="000000"/>
+          <w:insideV w:val="single" w:sz="4" w:space="0" w:color="000000"/>
+        </w:tblBorders>
+        <w:tblCellMar>
+          <w:top w:w="80" w:type="dxa"/>
+          <w:left w:w="120" w:type="dxa"/>
+          <w:bottom w:w="80" w:type="dxa"/>
+          <w:right w:w="120" w:type="dxa"/>
+        </w:tblCellMar>
+      </w:tblPr>
+      <w:tblGrid>
+        <w:gridCol w:w="2050"/>
+        <w:gridCol w:w="1300"/>
+        <w:gridCol w:w="2750"/>
+        <w:gridCol w:w="3260"/>
+      </w:tblGrid>
+      <w:tr>
+        <w:trPr>
+          <w:tblHeader/>
+        </w:trPr>
+        <w:tc>
+          <w:tcPr>
+            <w:tcW w:w="2050" w:type="dxa"/>
+            <w:tcMar>
+              <w:top w:w="100" w:type="dxa"/>
+              <w:left w:w="120" w:type="dxa"/>
+              <w:bottom w:w="100" w:type="dxa"/>
+              <w:right w:w="120" w:type="dxa"/>
+            </w:tcMar>
+            <w:vAlign w:val="center"/>
+            <w:shd w:fill="FFFFFF"/>
+          </w:tcPr>
+          <w:p>
+            <w:pPr>
+              <w:spacing w:after="0"/>
+            </w:pPr>
+            <w:r>
+              <w:rPr>
+                <w:b/>
+                <w:color w:val="auto"/>
+                <w:rFonts w:ascii="Times New Roman" w:hAnsi="Times New Roman" w:cs="Times New Roman"/>
+              </w:rPr>
+              <w:t>API</w:t>
+            </w:r>
+          </w:p>
+        </w:tc>
+        <w:tc>
+          <w:tcPr>
+            <w:tcW w:w="1300" w:type="dxa"/>
+            <w:tcMar>
+              <w:top w:w="100" w:type="dxa"/>
+              <w:left w:w="120" w:type="dxa"/>
+              <w:bottom w:w="100" w:type="dxa"/>
+              <w:right w:w="120" w:type="dxa"/>
+            </w:tcMar>
+            <w:vAlign w:val="center"/>
+            <w:shd w:fill="FFFFFF"/>
+          </w:tcPr>
+          <w:p>
+            <w:pPr>
+              <w:spacing w:after="0"/>
+            </w:pPr>
+            <w:r>
+              <w:rPr>
+                <w:b/>
+                <w:color w:val="auto"/>
+                <w:rFonts w:ascii="Times New Roman" w:hAnsi="Times New Roman" w:cs="Times New Roman"/>
+              </w:rPr>
+              <w:t>Auth</w:t>
+            </w:r>
+          </w:p>
+        </w:tc>
+        <w:tc>
+          <w:tcPr>
+            <w:tcW w:w="2750" w:type="dxa"/>
+            <w:tcMar>
+              <w:top w:w="100" w:type="dxa"/>
+              <w:left w:w="120" w:type="dxa"/>
+              <w:bottom w:w="100" w:type="dxa"/>
+              <w:right w:w="120" w:type="dxa"/>
+            </w:tcMar>
+            <w:vAlign w:val="center"/>
+            <w:shd w:fill="FFFFFF"/>
+          </w:tcPr>
+          <w:p>
+            <w:pPr>
+              <w:spacing w:after="0"/>
+            </w:pPr>
+            <w:r>
+              <w:rPr>
+                <w:b/>
+                <w:color w:val="auto"/>
+                <w:rFonts w:ascii="Times New Roman" w:hAnsi="Times New Roman" w:cs="Times New Roman"/>
+              </w:rPr>
+              <w:t>Purpose</w:t>
+            </w:r>
+          </w:p>
+        </w:tc>
+        <w:tc>
+          <w:tcPr>
+            <w:tcW w:w="3260" w:type="dxa"/>
+            <w:tcMar>
+              <w:top w:w="100" w:type="dxa"/>
+              <w:left w:w="120" w:type="dxa"/>
+              <w:bottom w:w="100" w:type="dxa"/>
+              <w:right w:w="120" w:type="dxa"/>
+            </w:tcMar>
+            <w:vAlign w:val="center"/>
+            <w:shd w:fill="FFFFFF"/>
+          </w:tcPr>
+          <w:p>
+            <w:pPr>
+              <w:spacing w:after="0"/>
+            </w:pPr>
+            <w:r>
+              <w:rPr>
+                <w:b/>
+                <w:color w:val="auto"/>
+                <w:rFonts w:ascii="Times New Roman" w:hAnsi="Times New Roman" w:cs="Times New Roman"/>
+              </w:rPr>
+              <w:t>Request / Response Notes</w:t>
+            </w:r>
+          </w:p>
+        </w:tc>
+      </w:tr>
+      <w:tr>
+        <w:tc>
+          <w:tcPr>
+            <w:tcW w:w="2050" w:type="dxa"/>
+            <w:tcMar>
+              <w:top w:w="100" w:type="dxa"/>
+              <w:left w:w="120" w:type="dxa"/>
+              <w:bottom w:w="100" w:type="dxa"/>
+              <w:right w:w="120" w:type="dxa"/>
+            </w:tcMar>
+            <w:vAlign w:val="center"/>
+          </w:tcPr>
+          <w:p>
+            <w:pPr>
+              <w:spacing w:after="0"/>
+            </w:pPr>
+            <w:r>
+              <w:rPr>
+                <w:color w:val="auto"/>
+                <w:rFonts w:ascii="Times New Roman" w:hAnsi="Times New Roman" w:cs="Times New Roman"/>
+              </w:rPr>
+              <w:t>GET /api/v1/public/sports/:slug</w:t>
+            </w:r>
+          </w:p>
+        </w:tc>
+        <w:tc>
+          <w:tcPr>
+            <w:tcW w:w="1300" w:type="dxa"/>
+            <w:tcMar>
+              <w:top w:w="100" w:type="dxa"/>
+              <w:left w:w="120" w:type="dxa"/>
+              <w:bottom w:w="100" w:type="dxa"/>
+              <w:right w:w="120" w:type="dxa"/>
+            </w:tcMar>
+            <w:vAlign w:val="center"/>
+          </w:tcPr>
+          <w:p>
+            <w:pPr>
+              <w:spacing w:after="0"/>
+            </w:pPr>
+            <w:r>
+              <w:rPr>
+                <w:color w:val="auto"/>
+                <w:rFonts w:ascii="Times New Roman" w:hAnsi="Times New Roman" w:cs="Times New Roman"/>
+              </w:rPr>
+              <w:t>Public</w:t>
+            </w:r>
+          </w:p>
+        </w:tc>
+        <w:tc>
+          <w:tcPr>
+            <w:tcW w:w="2750" w:type="dxa"/>
+            <w:tcMar>
+              <w:top w:w="100" w:type="dxa"/>
+              <w:left w:w="120" w:type="dxa"/>
+              <w:bottom w:w="100" w:type="dxa"/>
+              <w:right w:w="120" w:type="dxa"/>
+            </w:tcMar>
+            <w:vAlign w:val="center"/>
+          </w:tcPr>
+          <w:p>
+            <w:pPr>
+              <w:spacing w:after="0"/>
+            </w:pPr>
+            <w:r>
+              <w:rPr>
+                <w:color w:val="auto"/>
+                <w:rFonts w:ascii="Times New Roman" w:hAnsi="Times New Roman" w:cs="Times New Roman"/>
+              </w:rPr>
+              <w:t>Return selected sport details and grouped tournaments in exact order: upcoming, live, existing/completed.</w:t>
+            </w:r>
+          </w:p>
+        </w:tc>
+        <w:tc>
+          <w:tcPr>
+            <w:tcW w:w="3260" w:type="dxa"/>
+            <w:tcMar>
+              <w:top w:w="100" w:type="dxa"/>
+              <w:left w:w="120" w:type="dxa"/>
+              <w:bottom w:w="100" w:type="dxa"/>
+              <w:right w:w="120" w:type="dxa"/>
+            </w:tcMar>
+            <w:vAlign w:val="center"/>
+          </w:tcPr>
+          <w:p>
+            <w:pPr>
+              <w:spacing w:after="0"/>
+            </w:pPr>
+            <w:r>
+              <w:rPr>
+                <w:color w:val="auto"/>
+                <w:rFonts w:ascii="Times New Roman" w:hAnsi="Times New Roman" w:cs="Times New Roman"/>
+              </w:rPr>
+              <w:t>Response includes sport, tournaments[], groups.upcoming[], groups.live[], groups.existing[]. Selected sport page must not display tournaments from other sports.</w:t>
+            </w:r>
+          </w:p>
+        </w:tc>
+      </w:tr>
+      <w:tr>
+        <w:tc>
+          <w:tcPr>
+            <w:tcW w:w="2050" w:type="dxa"/>
+            <w:tcMar>
+              <w:top w:w="100" w:type="dxa"/>
+              <w:left w:w="120" w:type="dxa"/>
+              <w:bottom w:w="100" w:type="dxa"/>
+              <w:right w:w="120" w:type="dxa"/>
+            </w:tcMar>
+            <w:vAlign w:val="center"/>
+          </w:tcPr>
+          <w:p>
+            <w:pPr>
+              <w:spacing w:after="0"/>
+            </w:pPr>
+            <w:r>
+              <w:rPr>
+                <w:color w:val="auto"/>
+                <w:rFonts w:ascii="Times New Roman" w:hAnsi="Times New Roman" w:cs="Times New Roman"/>
+              </w:rPr>
+              <w:t>GET /api/v1/public/tournaments/:slug</w:t>
+            </w:r>
+          </w:p>
+        </w:tc>
+        <w:tc>
+          <w:tcPr>
+            <w:tcW w:w="1300" w:type="dxa"/>
+            <w:tcMar>
+              <w:top w:w="100" w:type="dxa"/>
+              <w:left w:w="120" w:type="dxa"/>
+              <w:bottom w:w="100" w:type="dxa"/>
+              <w:right w:w="120" w:type="dxa"/>
+            </w:tcMar>
+            <w:vAlign w:val="center"/>
+          </w:tcPr>
+          <w:p>
+            <w:pPr>
+              <w:spacing w:after="0"/>
+            </w:pPr>
+            <w:r>
+              <w:rPr>
+                <w:color w:val="auto"/>
+                <w:rFonts w:ascii="Times New Roman" w:hAnsi="Times New Roman" w:cs="Times New Roman"/>
+              </w:rPr>
+              <w:t>Public</w:t>
+            </w:r>
+          </w:p>
+        </w:tc>
+        <w:tc>
+          <w:tcPr>
+            <w:tcW w:w="2750" w:type="dxa"/>
+            <w:tcMar>
+              <w:top w:w="100" w:type="dxa"/>
+              <w:left w:w="120" w:type="dxa"/>
+              <w:bottom w:w="100" w:type="dxa"/>
+              <w:right w:w="120" w:type="dxa"/>
+            </w:tcMar>
+            <w:vAlign w:val="center"/>
+          </w:tcPr>
+          <w:p>
+            <w:pPr>
+              <w:spacing w:after="0"/>
+            </w:pPr>
+            <w:r>
+              <w:rPr>
+                <w:color w:val="auto"/>
+                <w:rFonts w:ascii="Times New Roman" w:hAnsi="Times New Roman" w:cs="Times New Roman"/>
+              </w:rPr>
+              <w:t>Return tournament detail used by status-aware pages and registration.</w:t>
+            </w:r>
+          </w:p>
+        </w:tc>
+        <w:tc>
+          <w:tcPr>
+            <w:tcW w:w="3260" w:type="dxa"/>
+            <w:tcMar>
+              <w:top w:w="100" w:type="dxa"/>
+              <w:left w:w="120" w:type="dxa"/>
+              <w:bottom w:w="100" w:type="dxa"/>
+              <w:right w:w="120" w:type="dxa"/>
+            </w:tcMar>
+            <w:vAlign w:val="center"/>
+          </w:tcPr>
+          <w:p>
+            <w:pPr>
+              <w:spacing w:after="0"/>
+            </w:pPr>
+            <w:r>
+              <w:rPr>
+                <w:color w:val="auto"/>
+                <w:rFonts w:ascii="Times New Roman" w:hAnsi="Times New Roman" w:cs="Times New Roman"/>
+              </w:rPr>
+              <w:t>Response includes status, sport, teams, capacity, team_size, prize, venue/date/image metadata. Registration form uses team_size.</w:t>
+            </w:r>
+          </w:p>
+        </w:tc>
+      </w:tr>
+      <w:tr>
+        <w:tc>
+          <w:tcPr>
+            <w:tcW w:w="2050" w:type="dxa"/>
+            <w:tcMar>
+              <w:top w:w="100" w:type="dxa"/>
+              <w:left w:w="120" w:type="dxa"/>
+              <w:bottom w:w="100" w:type="dxa"/>
+              <w:right w:w="120" w:type="dxa"/>
+            </w:tcMar>
+            <w:vAlign w:val="center"/>
+          </w:tcPr>
+          <w:p>
+            <w:pPr>
+              <w:spacing w:after="0"/>
+            </w:pPr>
+            <w:r>
+              <w:rPr>
+                <w:color w:val="auto"/>
+                <w:rFonts w:ascii="Times New Roman" w:hAnsi="Times New Roman" w:cs="Times New Roman"/>
+              </w:rPr>
+              <w:t>GET /api/v1/public/tournaments/:slug/bracket</w:t>
+            </w:r>
+          </w:p>
+        </w:tc>
+        <w:tc>
+          <w:tcPr>
+            <w:tcW w:w="1300" w:type="dxa"/>
+            <w:tcMar>
+              <w:top w:w="100" w:type="dxa"/>
+              <w:left w:w="120" w:type="dxa"/>
+              <w:bottom w:w="100" w:type="dxa"/>
+              <w:right w:w="120" w:type="dxa"/>
+            </w:tcMar>
+            <w:vAlign w:val="center"/>
+          </w:tcPr>
+          <w:p>
+            <w:pPr>
+              <w:spacing w:after="0"/>
+            </w:pPr>
+            <w:r>
+              <w:rPr>
+                <w:color w:val="auto"/>
+                <w:rFonts w:ascii="Times New Roman" w:hAnsi="Times New Roman" w:cs="Times New Roman"/>
+              </w:rPr>
+              <w:t>Public</w:t>
+            </w:r>
+          </w:p>
+        </w:tc>
+        <w:tc>
+          <w:tcPr>
+            <w:tcW w:w="2750" w:type="dxa"/>
+            <w:tcMar>
+              <w:top w:w="100" w:type="dxa"/>
+              <w:left w:w="120" w:type="dxa"/>
+              <w:bottom w:w="100" w:type="dxa"/>
+              <w:right w:w="120" w:type="dxa"/>
+            </w:tcMar>
+            <w:vAlign w:val="center"/>
+          </w:tcPr>
+          <w:p>
+            <w:pPr>
+              <w:spacing w:after="0"/>
+            </w:pPr>
+            <w:r>
+              <w:rPr>
+                <w:color w:val="auto"/>
+                <w:rFonts w:ascii="Times New Roman" w:hAnsi="Times New Roman" w:cs="Times New Roman"/>
+              </w:rPr>
+              <w:t>Return published bracket nodes/connections for Rounds page.</w:t>
+            </w:r>
+          </w:p>
+        </w:tc>
+        <w:tc>
+          <w:tcPr>
+            <w:tcW w:w="3260" w:type="dxa"/>
+            <w:tcMar>
+              <w:top w:w="100" w:type="dxa"/>
+              <w:left w:w="120" w:type="dxa"/>
+              <w:bottom w:w="100" w:type="dxa"/>
+              <w:right w:w="120" w:type="dxa"/>
+            </w:tcMar>
+            <w:vAlign w:val="center"/>
+          </w:tcPr>
+          <w:p>
+            <w:pPr>
+              <w:spacing w:after="0"/>
+            </w:pPr>
+            <w:r>
+              <w:rPr>
+                <w:color w:val="auto"/>
+                <w:rFonts w:ascii="Times New Roman" w:hAnsi="Times New Roman" w:cs="Times New Roman"/>
+              </w:rPr>
+              <w:t>Upcoming tournaments render blank locked circles and connector lines only. Live/existing tournaments can render teams, rounds, score records, and winner paths.</w:t>
+            </w:r>
+          </w:p>
+        </w:tc>
+      </w:tr>
+      <w:tr>
+        <w:tc>
+          <w:tcPr>
+            <w:tcW w:w="2050" w:type="dxa"/>
+            <w:tcMar>
+              <w:top w:w="100" w:type="dxa"/>
+              <w:left w:w="120" w:type="dxa"/>
+              <w:bottom w:w="100" w:type="dxa"/>
+              <w:right w:w="120" w:type="dxa"/>
+            </w:tcMar>
+            <w:vAlign w:val="center"/>
+          </w:tcPr>
+          <w:p>
+            <w:pPr>
+              <w:spacing w:after="0"/>
+            </w:pPr>
+            <w:r>
+              <w:rPr>
+                <w:color w:val="auto"/>
+                <w:rFonts w:ascii="Times New Roman" w:hAnsi="Times New Roman" w:cs="Times New Roman"/>
+              </w:rPr>
+              <w:t>POST /api/v1/registrations</w:t>
+            </w:r>
+          </w:p>
+        </w:tc>
+        <w:tc>
+          <w:tcPr>
+            <w:tcW w:w="1300" w:type="dxa"/>
+            <w:tcMar>
+              <w:top w:w="100" w:type="dxa"/>
+              <w:left w:w="120" w:type="dxa"/>
+              <w:bottom w:w="100" w:type="dxa"/>
+              <w:right w:w="120" w:type="dxa"/>
+            </w:tcMar>
+            <w:vAlign w:val="center"/>
+          </w:tcPr>
+          <w:p>
+            <w:pPr>
+              <w:spacing w:after="0"/>
+            </w:pPr>
+            <w:r>
+              <w:rPr>
+                <w:color w:val="auto"/>
+                <w:rFonts w:ascii="Times New Roman" w:hAnsi="Times New Roman" w:cs="Times New Roman"/>
+              </w:rPr>
+              <w:t>Public with validation / CAPTCHA in production</w:t>
+            </w:r>
+          </w:p>
+        </w:tc>
+        <w:tc>
+          <w:tcPr>
+            <w:tcW w:w="2750" w:type="dxa"/>
+            <w:tcMar>
+              <w:top w:w="100" w:type="dxa"/>
+              <w:left w:w="120" w:type="dxa"/>
+              <w:bottom w:w="100" w:type="dxa"/>
+              <w:right w:w="120" w:type="dxa"/>
+            </w:tcMar>
+            <w:vAlign w:val="center"/>
+          </w:tcPr>
+          <w:p>
+            <w:pPr>
+              <w:spacing w:after="0"/>
+            </w:pPr>
+            <w:r>
+              <w:rPr>
+                <w:color w:val="auto"/>
+                <w:rFonts w:ascii="Times New Roman" w:hAnsi="Times New Roman" w:cs="Times New Roman"/>
+              </w:rPr>
+              <w:t>Create tournament registration with team details and member details.</w:t>
+            </w:r>
+          </w:p>
+        </w:tc>
+        <w:tc>
+          <w:tcPr>
+            <w:tcW w:w="3260" w:type="dxa"/>
+            <w:tcMar>
+              <w:top w:w="100" w:type="dxa"/>
+              <w:left w:w="120" w:type="dxa"/>
+              <w:bottom w:w="100" w:type="dxa"/>
+              <w:right w:w="120" w:type="dxa"/>
+            </w:tcMar>
+            <w:vAlign w:val="center"/>
+          </w:tcPr>
+          <w:p>
+            <w:pPr>
+              <w:spacing w:after="0"/>
+            </w:pPr>
+            <w:r>
+              <w:rPr>
+                <w:color w:val="auto"/>
+                <w:rFonts w:ascii="Times New Roman" w:hAnsi="Times New Roman" w:cs="Times New Roman"/>
+              </w:rPr>
+              <w:t>Body includes tournament_slug, team_name, captain_name, email, phone, members[]. members[] count must equal tournament.team_size and includes captain plus sub-captain.</w:t>
+            </w:r>
+          </w:p>
+        </w:tc>
+      </w:tr>
+      <w:tr>
+        <w:tc>
+          <w:tcPr>
+            <w:tcW w:w="2050" w:type="dxa"/>
+            <w:tcMar>
+              <w:top w:w="100" w:type="dxa"/>
+              <w:left w:w="120" w:type="dxa"/>
+              <w:bottom w:w="100" w:type="dxa"/>
+              <w:right w:w="120" w:type="dxa"/>
+            </w:tcMar>
+            <w:vAlign w:val="center"/>
+          </w:tcPr>
+          <w:p>
+            <w:pPr>
+              <w:spacing w:after="0"/>
+            </w:pPr>
+            <w:r>
+              <w:rPr>
+                <w:color w:val="auto"/>
+                <w:rFonts w:ascii="Times New Roman" w:hAnsi="Times New Roman" w:cs="Times New Roman"/>
+              </w:rPr>
+              <w:t>POST /api/v1/management/registrations/:registrationId/approve</w:t>
+            </w:r>
+          </w:p>
+        </w:tc>
+        <w:tc>
+          <w:tcPr>
+            <w:tcW w:w="1300" w:type="dxa"/>
+            <w:tcMar>
+              <w:top w:w="100" w:type="dxa"/>
+              <w:left w:w="120" w:type="dxa"/>
+              <w:bottom w:w="100" w:type="dxa"/>
+              <w:right w:w="120" w:type="dxa"/>
+            </w:tcMar>
+            <w:vAlign w:val="center"/>
+          </w:tcPr>
+          <w:p>
+            <w:pPr>
+              <w:spacing w:after="0"/>
+            </w:pPr>
+            <w:r>
+              <w:rPr>
+                <w:color w:val="auto"/>
+                <w:rFonts w:ascii="Times New Roman" w:hAnsi="Times New Roman" w:cs="Times New Roman"/>
+              </w:rPr>
+              <w:t>Management or Super Admin</w:t>
+            </w:r>
+          </w:p>
+        </w:tc>
+        <w:tc>
+          <w:tcPr>
+            <w:tcW w:w="2750" w:type="dxa"/>
+            <w:tcMar>
+              <w:top w:w="100" w:type="dxa"/>
+              <w:left w:w="120" w:type="dxa"/>
+              <w:bottom w:w="100" w:type="dxa"/>
+              <w:right w:w="120" w:type="dxa"/>
+            </w:tcMar>
+            <w:vAlign w:val="center"/>
+          </w:tcPr>
+          <w:p>
+            <w:pPr>
+              <w:spacing w:after="0"/>
+            </w:pPr>
+            <w:r>
+              <w:rPr>
+                <w:color w:val="auto"/>
+                <w:rFonts w:ascii="Times New Roman" w:hAnsi="Times New Roman" w:cs="Times New Roman"/>
+              </w:rPr>
+              <w:t>Approve registration after payment/document review.</w:t>
+            </w:r>
+          </w:p>
+        </w:tc>
+        <w:tc>
+          <w:tcPr>
+            <w:tcW w:w="3260" w:type="dxa"/>
+            <w:tcMar>
+              <w:top w:w="100" w:type="dxa"/>
+              <w:left w:w="120" w:type="dxa"/>
+              <w:bottom w:w="100" w:type="dxa"/>
+              <w:right w:w="120" w:type="dxa"/>
+            </w:tcMar>
+            <w:vAlign w:val="center"/>
+          </w:tcPr>
+          <w:p>
+            <w:pPr>
+              <w:spacing w:after="0"/>
+            </w:pPr>
+            <w:r>
+              <w:rPr>
+                <w:color w:val="auto"/>
+                <w:rFonts w:ascii="Times New Roman" w:hAnsi="Times New Roman" w:cs="Times New Roman"/>
+              </w:rPr>
+              <w:t>Updates registration status to accepted, writes audit log, and makes team available to bracket allocation.</w:t>
+            </w:r>
+          </w:p>
+        </w:tc>
+      </w:tr>
+      <w:tr>
+        <w:tc>
+          <w:tcPr>
+            <w:tcW w:w="2050" w:type="dxa"/>
+            <w:tcMar>
+              <w:top w:w="100" w:type="dxa"/>
+              <w:left w:w="120" w:type="dxa"/>
+              <w:bottom w:w="100" w:type="dxa"/>
+              <w:right w:w="120" w:type="dxa"/>
+            </w:tcMar>
+            <w:vAlign w:val="center"/>
+          </w:tcPr>
+          <w:p>
+            <w:pPr>
+              <w:spacing w:after="0"/>
+            </w:pPr>
+            <w:r>
+              <w:rPr>
+                <w:color w:val="auto"/>
+                <w:rFonts w:ascii="Times New Roman" w:hAnsi="Times New Roman" w:cs="Times New Roman"/>
+              </w:rPr>
+              <w:t>POST /api/v1/management/registrations/:registrationId/reject</w:t>
+            </w:r>
+          </w:p>
+        </w:tc>
+        <w:tc>
+          <w:tcPr>
+            <w:tcW w:w="1300" w:type="dxa"/>
+            <w:tcMar>
+              <w:top w:w="100" w:type="dxa"/>
+              <w:left w:w="120" w:type="dxa"/>
+              <w:bottom w:w="100" w:type="dxa"/>
+              <w:right w:w="120" w:type="dxa"/>
+            </w:tcMar>
+            <w:vAlign w:val="center"/>
+          </w:tcPr>
+          <w:p>
+            <w:pPr>
+              <w:spacing w:after="0"/>
+            </w:pPr>
+            <w:r>
+              <w:rPr>
+                <w:color w:val="auto"/>
+                <w:rFonts w:ascii="Times New Roman" w:hAnsi="Times New Roman" w:cs="Times New Roman"/>
+              </w:rPr>
+              <w:t>Management or Super Admin</w:t>
+            </w:r>
+          </w:p>
+        </w:tc>
+        <w:tc>
+          <w:tcPr>
+            <w:tcW w:w="2750" w:type="dxa"/>
+            <w:tcMar>
+              <w:top w:w="100" w:type="dxa"/>
+              <w:left w:w="120" w:type="dxa"/>
+              <w:bottom w:w="100" w:type="dxa"/>
+              <w:right w:w="120" w:type="dxa"/>
+            </w:tcMar>
+            <w:vAlign w:val="center"/>
+          </w:tcPr>
+          <w:p>
+            <w:pPr>
+              <w:spacing w:after="0"/>
+            </w:pPr>
+            <w:r>
+              <w:rPr>
+                <w:color w:val="auto"/>
+                <w:rFonts w:ascii="Times New Roman" w:hAnsi="Times New Roman" w:cs="Times New Roman"/>
+              </w:rPr>
+              <w:t>Reject registration with audit trail.</w:t>
+            </w:r>
+          </w:p>
+        </w:tc>
+        <w:tc>
+          <w:tcPr>
+            <w:tcW w:w="3260" w:type="dxa"/>
+            <w:tcMar>
+              <w:top w:w="100" w:type="dxa"/>
+              <w:left w:w="120" w:type="dxa"/>
+              <w:bottom w:w="100" w:type="dxa"/>
+              <w:right w:w="120" w:type="dxa"/>
+            </w:tcMar>
+            <w:vAlign w:val="center"/>
+          </w:tcPr>
+          <w:p>
+            <w:pPr>
+              <w:spacing w:after="0"/>
+            </w:pPr>
+            <w:r>
+              <w:rPr>
+                <w:color w:val="auto"/>
+                <w:rFonts w:ascii="Times New Roman" w:hAnsi="Times New Roman" w:cs="Times New Roman"/>
+              </w:rPr>
+              <w:t>Updates registration status to rejected, writes audit log, and should trigger manual/queued notification.</w:t>
+            </w:r>
+          </w:p>
+        </w:tc>
+      </w:tr>
+      <w:tr>
+        <w:tc>
+          <w:tcPr>
+            <w:tcW w:w="2050" w:type="dxa"/>
+            <w:tcMar>
+              <w:top w:w="100" w:type="dxa"/>
+              <w:left w:w="120" w:type="dxa"/>
+              <w:bottom w:w="100" w:type="dxa"/>
+              <w:right w:w="120" w:type="dxa"/>
+            </w:tcMar>
+            <w:vAlign w:val="center"/>
+          </w:tcPr>
+          <w:p>
+            <w:pPr>
+              <w:spacing w:after="0"/>
+            </w:pPr>
+            <w:r>
+              <w:rPr>
+                <w:color w:val="auto"/>
+                <w:rFonts w:ascii="Times New Roman" w:hAnsi="Times New Roman" w:cs="Times New Roman"/>
+              </w:rPr>
+              <w:t>PATCH /api/v1/management/tournaments/:slug/team-size</w:t>
+            </w:r>
+          </w:p>
+        </w:tc>
+        <w:tc>
+          <w:tcPr>
+            <w:tcW w:w="1300" w:type="dxa"/>
+            <w:tcMar>
+              <w:top w:w="100" w:type="dxa"/>
+              <w:left w:w="120" w:type="dxa"/>
+              <w:bottom w:w="100" w:type="dxa"/>
+              <w:right w:w="120" w:type="dxa"/>
+            </w:tcMar>
+            <w:vAlign w:val="center"/>
+          </w:tcPr>
+          <w:p>
+            <w:pPr>
+              <w:spacing w:after="0"/>
+            </w:pPr>
+            <w:r>
+              <w:rPr>
+                <w:color w:val="auto"/>
+                <w:rFonts w:ascii="Times New Roman" w:hAnsi="Times New Roman" w:cs="Times New Roman"/>
+              </w:rPr>
+              <w:t>Management or Super Admin</w:t>
+            </w:r>
+          </w:p>
+        </w:tc>
+        <w:tc>
+          <w:tcPr>
+            <w:tcW w:w="2750" w:type="dxa"/>
+            <w:tcMar>
+              <w:top w:w="100" w:type="dxa"/>
+              <w:left w:w="120" w:type="dxa"/>
+              <w:bottom w:w="100" w:type="dxa"/>
+              <w:right w:w="120" w:type="dxa"/>
+            </w:tcMar>
+            <w:vAlign w:val="center"/>
+          </w:tcPr>
+          <w:p>
+            <w:pPr>
+              <w:spacing w:after="0"/>
+            </w:pPr>
+            <w:r>
+              <w:rPr>
+                <w:color w:val="auto"/>
+                <w:rFonts w:ascii="Times New Roman" w:hAnsi="Times New Roman" w:cs="Times New Roman"/>
+              </w:rPr>
+              <w:t>Set members-per-team on tournament create/configuration page.</w:t>
+            </w:r>
+          </w:p>
+        </w:tc>
+        <w:tc>
+          <w:tcPr>
+            <w:tcW w:w="3260" w:type="dxa"/>
+            <w:tcMar>
+              <w:top w:w="100" w:type="dxa"/>
+              <w:left w:w="120" w:type="dxa"/>
+              <w:bottom w:w="100" w:type="dxa"/>
+              <w:right w:w="120" w:type="dxa"/>
+            </w:tcMar>
+            <w:vAlign w:val="center"/>
+          </w:tcPr>
+          <w:p>
+            <w:pPr>
+              <w:spacing w:after="0"/>
+            </w:pPr>
+            <w:r>
+              <w:rPr>
+                <w:color w:val="auto"/>
+                <w:rFonts w:ascii="Times New Roman" w:hAnsi="Times New Roman" w:cs="Times New Roman"/>
+              </w:rPr>
+              <w:t>Body: { team_size: number }. Accepted range: 2-60. Registration uses this number for member-name inputs and backend validation.</w:t>
+            </w:r>
+          </w:p>
+        </w:tc>
+      </w:tr>
+      <w:tr>
+        <w:tc>
+          <w:tcPr>
+            <w:tcW w:w="2050" w:type="dxa"/>
+            <w:tcMar>
+              <w:top w:w="100" w:type="dxa"/>
+              <w:left w:w="120" w:type="dxa"/>
+              <w:bottom w:w="100" w:type="dxa"/>
+              <w:right w:w="120" w:type="dxa"/>
+            </w:tcMar>
+            <w:vAlign w:val="center"/>
+          </w:tcPr>
+          <w:p>
+            <w:pPr>
+              <w:spacing w:after="0"/>
+            </w:pPr>
+            <w:r>
+              <w:rPr>
+                <w:color w:val="auto"/>
+                <w:rFonts w:ascii="Times New Roman" w:hAnsi="Times New Roman" w:cs="Times New Roman"/>
+              </w:rPr>
+              <w:t>GET /api/v1/management/brackets/:tournamentSlug</w:t>
+            </w:r>
+          </w:p>
+        </w:tc>
+        <w:tc>
+          <w:tcPr>
+            <w:tcW w:w="1300" w:type="dxa"/>
+            <w:tcMar>
+              <w:top w:w="100" w:type="dxa"/>
+              <w:left w:w="120" w:type="dxa"/>
+              <w:bottom w:w="100" w:type="dxa"/>
+              <w:right w:w="120" w:type="dxa"/>
+            </w:tcMar>
+            <w:vAlign w:val="center"/>
+          </w:tcPr>
+          <w:p>
+            <w:pPr>
+              <w:spacing w:after="0"/>
+            </w:pPr>
+            <w:r>
+              <w:rPr>
+                <w:color w:val="auto"/>
+                <w:rFonts w:ascii="Times New Roman" w:hAnsi="Times New Roman" w:cs="Times New Roman"/>
+              </w:rPr>
+              <w:t>Management or Super Admin</w:t>
+            </w:r>
+          </w:p>
+        </w:tc>
+        <w:tc>
+          <w:tcPr>
+            <w:tcW w:w="2750" w:type="dxa"/>
+            <w:tcMar>
+              <w:top w:w="100" w:type="dxa"/>
+              <w:left w:w="120" w:type="dxa"/>
+              <w:bottom w:w="100" w:type="dxa"/>
+              <w:right w:w="120" w:type="dxa"/>
+            </w:tcMar>
+            <w:vAlign w:val="center"/>
+          </w:tcPr>
+          <w:p>
+            <w:pPr>
+              <w:spacing w:after="0"/>
+            </w:pPr>
+            <w:r>
+              <w:rPr>
+                <w:color w:val="auto"/>
+                <w:rFonts w:ascii="Times New Roman" w:hAnsi="Times New Roman" w:cs="Times New Roman"/>
+              </w:rPr>
+              <w:t>Load manager bracket allocation workspace.</w:t>
+            </w:r>
+          </w:p>
+        </w:tc>
+        <w:tc>
+          <w:tcPr>
+            <w:tcW w:w="3260" w:type="dxa"/>
+            <w:tcMar>
+              <w:top w:w="100" w:type="dxa"/>
+              <w:left w:w="120" w:type="dxa"/>
+              <w:bottom w:w="100" w:type="dxa"/>
+              <w:right w:w="120" w:type="dxa"/>
+            </w:tcMar>
+            <w:vAlign w:val="center"/>
+          </w:tcPr>
+          <w:p>
+            <w:pPr>
+              <w:spacing w:after="0"/>
+            </w:pPr>
+            <w:r>
+              <w:rPr>
+                <w:color w:val="auto"/>
+                <w:rFonts w:ascii="Times New Roman" w:hAnsi="Times New Roman" w:cs="Times New Roman"/>
+              </w:rPr>
+              <w:t>Response includes acceptedTeams[], nodes[], connections[], notifications[]. Accepted registrations feed the team list.</w:t>
+            </w:r>
+          </w:p>
+        </w:tc>
+      </w:tr>
+      <w:tr>
+        <w:tc>
+          <w:tcPr>
+            <w:tcW w:w="2050" w:type="dxa"/>
+            <w:tcMar>
+              <w:top w:w="100" w:type="dxa"/>
+              <w:left w:w="120" w:type="dxa"/>
+              <w:bottom w:w="100" w:type="dxa"/>
+              <w:right w:w="120" w:type="dxa"/>
+            </w:tcMar>
+            <w:vAlign w:val="center"/>
+          </w:tcPr>
+          <w:p>
+            <w:pPr>
+              <w:spacing w:after="0"/>
+            </w:pPr>
+            <w:r>
+              <w:rPr>
+                <w:color w:val="auto"/>
+                <w:rFonts w:ascii="Times New Roman" w:hAnsi="Times New Roman" w:cs="Times New Roman"/>
+              </w:rPr>
+              <w:t>POST /api/v1/management/brackets/:tournamentSlug/save</w:t>
+            </w:r>
+          </w:p>
+        </w:tc>
+        <w:tc>
+          <w:tcPr>
+            <w:tcW w:w="1300" w:type="dxa"/>
+            <w:tcMar>
+              <w:top w:w="100" w:type="dxa"/>
+              <w:left w:w="120" w:type="dxa"/>
+              <w:bottom w:w="100" w:type="dxa"/>
+              <w:right w:w="120" w:type="dxa"/>
+            </w:tcMar>
+            <w:vAlign w:val="center"/>
+          </w:tcPr>
+          <w:p>
+            <w:pPr>
+              <w:spacing w:after="0"/>
+            </w:pPr>
+            <w:r>
+              <w:rPr>
+                <w:color w:val="auto"/>
+                <w:rFonts w:ascii="Times New Roman" w:hAnsi="Times New Roman" w:cs="Times New Roman"/>
+              </w:rPr>
+              <w:t>Management or Super Admin</w:t>
+            </w:r>
+          </w:p>
+        </w:tc>
+        <w:tc>
+          <w:tcPr>
+            <w:tcW w:w="2750" w:type="dxa"/>
+            <w:tcMar>
+              <w:top w:w="100" w:type="dxa"/>
+              <w:left w:w="120" w:type="dxa"/>
+              <w:bottom w:w="100" w:type="dxa"/>
+              <w:right w:w="120" w:type="dxa"/>
+            </w:tcMar>
+            <w:vAlign w:val="center"/>
+          </w:tcPr>
+          <w:p>
+            <w:pPr>
+              <w:spacing w:after="0"/>
+            </w:pPr>
+            <w:r>
+              <w:rPr>
+                <w:color w:val="auto"/>
+                <w:rFonts w:ascii="Times New Roman" w:hAnsi="Times New Roman" w:cs="Times New Roman"/>
+              </w:rPr>
+              <w:t>Persist bracket nodes, connections, rounds, pair state, cancel/rematch state, and winner paths.</w:t>
+            </w:r>
+          </w:p>
+        </w:tc>
+        <w:tc>
+          <w:tcPr>
+            <w:tcW w:w="3260" w:type="dxa"/>
+            <w:tcMar>
+              <w:top w:w="100" w:type="dxa"/>
+              <w:left w:w="120" w:type="dxa"/>
+              <w:bottom w:w="100" w:type="dxa"/>
+              <w:right w:w="120" w:type="dxa"/>
+            </w:tcMar>
+            <w:vAlign w:val="center"/>
+          </w:tcPr>
+          <w:p>
+            <w:pPr>
+              <w:spacing w:after="0"/>
+            </w:pPr>
+            <w:r>
+              <w:rPr>
+                <w:color w:val="auto"/>
+                <w:rFonts w:ascii="Times New Roman" w:hAnsi="Times New Roman" w:cs="Times New Roman"/>
+              </w:rPr>
+              <w:t>Body includes nodes[], connections[], publish, audit_reason. No autosave; frontend enables Save only after changes.</w:t>
+            </w:r>
+          </w:p>
+        </w:tc>
+      </w:tr>
+      <w:tr>
+        <w:tc>
+          <w:tcPr>
+            <w:tcW w:w="2050" w:type="dxa"/>
+            <w:tcMar>
+              <w:top w:w="100" w:type="dxa"/>
+              <w:left w:w="120" w:type="dxa"/>
+              <w:bottom w:w="100" w:type="dxa"/>
+              <w:right w:w="120" w:type="dxa"/>
+            </w:tcMar>
+            <w:vAlign w:val="center"/>
+          </w:tcPr>
+          <w:p>
+            <w:pPr>
+              <w:spacing w:after="0"/>
+            </w:pPr>
+            <w:r>
+              <w:rPr>
+                <w:color w:val="auto"/>
+                <w:rFonts w:ascii="Times New Roman" w:hAnsi="Times New Roman" w:cs="Times New Roman"/>
+              </w:rPr>
+              <w:t>POST /api/v1/management/brackets/:tournamentSlug/advance-winner</w:t>
+            </w:r>
+          </w:p>
+        </w:tc>
+        <w:tc>
+          <w:tcPr>
+            <w:tcW w:w="1300" w:type="dxa"/>
+            <w:tcMar>
+              <w:top w:w="100" w:type="dxa"/>
+              <w:left w:w="120" w:type="dxa"/>
+              <w:bottom w:w="100" w:type="dxa"/>
+              <w:right w:w="120" w:type="dxa"/>
+            </w:tcMar>
+            <w:vAlign w:val="center"/>
+          </w:tcPr>
+          <w:p>
+            <w:pPr>
+              <w:spacing w:after="0"/>
+            </w:pPr>
+            <w:r>
+              <w:rPr>
+                <w:color w:val="auto"/>
+                <w:rFonts w:ascii="Times New Roman" w:hAnsi="Times New Roman" w:cs="Times New Roman"/>
+              </w:rPr>
+              <w:t>Management or Super Admin</w:t>
+            </w:r>
+          </w:p>
+        </w:tc>
+        <w:tc>
+          <w:tcPr>
+            <w:tcW w:w="2750" w:type="dxa"/>
+            <w:tcMar>
+              <w:top w:w="100" w:type="dxa"/>
+              <w:left w:w="120" w:type="dxa"/>
+              <w:bottom w:w="100" w:type="dxa"/>
+              <w:right w:w="120" w:type="dxa"/>
+            </w:tcMar>
+            <w:vAlign w:val="center"/>
+          </w:tcPr>
+          <w:p>
+            <w:pPr>
+              <w:spacing w:after="0"/>
+            </w:pPr>
+            <w:r>
+              <w:rPr>
+                <w:color w:val="auto"/>
+                <w:rFonts w:ascii="Times New Roman" w:hAnsi="Times New Roman" w:cs="Times New Roman"/>
+              </w:rPr>
+              <w:t>Move winner into next round from score result or approved override.</w:t>
+            </w:r>
+          </w:p>
+        </w:tc>
+        <w:tc>
+          <w:tcPr>
+            <w:tcW w:w="3260" w:type="dxa"/>
+            <w:tcMar>
+              <w:top w:w="100" w:type="dxa"/>
+              <w:left w:w="120" w:type="dxa"/>
+              <w:bottom w:w="100" w:type="dxa"/>
+              <w:right w:w="120" w:type="dxa"/>
+            </w:tcMar>
+            <w:vAlign w:val="center"/>
+          </w:tcPr>
+          <w:p>
+            <w:pPr>
+              <w:spacing w:after="0"/>
+            </w:pPr>
+            <w:r>
+              <w:rPr>
+                <w:color w:val="auto"/>
+                <w:rFonts w:ascii="Times New Roman" w:hAnsi="Times New Roman" w:cs="Times New Roman"/>
+              </w:rPr>
+              <w:t>Body includes winner_team, target_node_id, audit_reason. Manual override requires role permission and audit reason.</w:t>
+            </w:r>
+          </w:p>
+        </w:tc>
+      </w:tr>
+      <w:tr>
+        <w:tc>
+          <w:tcPr>
+            <w:tcW w:w="2050" w:type="dxa"/>
+            <w:tcMar>
+              <w:top w:w="100" w:type="dxa"/>
+              <w:left w:w="120" w:type="dxa"/>
+              <w:bottom w:w="100" w:type="dxa"/>
+              <w:right w:w="120" w:type="dxa"/>
+            </w:tcMar>
+            <w:vAlign w:val="center"/>
+          </w:tcPr>
+          <w:p>
+            <w:pPr>
+              <w:spacing w:after="0"/>
+            </w:pPr>
+            <w:r>
+              <w:rPr>
+                <w:color w:val="auto"/>
+                <w:rFonts w:ascii="Times New Roman" w:hAnsi="Times New Roman" w:cs="Times New Roman"/>
+              </w:rPr>
+              <w:t>POST /api/v1/management/brackets/:tournamentSlug/notify</w:t>
+            </w:r>
+          </w:p>
+        </w:tc>
+        <w:tc>
+          <w:tcPr>
+            <w:tcW w:w="1300" w:type="dxa"/>
+            <w:tcMar>
+              <w:top w:w="100" w:type="dxa"/>
+              <w:left w:w="120" w:type="dxa"/>
+              <w:bottom w:w="100" w:type="dxa"/>
+              <w:right w:w="120" w:type="dxa"/>
+            </w:tcMar>
+            <w:vAlign w:val="center"/>
+          </w:tcPr>
+          <w:p>
+            <w:pPr>
+              <w:spacing w:after="0"/>
+            </w:pPr>
+            <w:r>
+              <w:rPr>
+                <w:color w:val="auto"/>
+                <w:rFonts w:ascii="Times New Roman" w:hAnsi="Times New Roman" w:cs="Times New Roman"/>
+              </w:rPr>
+              <w:t>Management or Super Admin</w:t>
+            </w:r>
+          </w:p>
+        </w:tc>
+        <w:tc>
+          <w:tcPr>
+            <w:tcW w:w="2750" w:type="dxa"/>
+            <w:tcMar>
+              <w:top w:w="100" w:type="dxa"/>
+              <w:left w:w="120" w:type="dxa"/>
+              <w:bottom w:w="100" w:type="dxa"/>
+              <w:right w:w="120" w:type="dxa"/>
+            </w:tcMar>
+            <w:vAlign w:val="center"/>
+          </w:tcPr>
+          <w:p>
+            <w:pPr>
+              <w:spacing w:after="0"/>
+            </w:pPr>
+            <w:r>
+              <w:rPr>
+                <w:color w:val="auto"/>
+                <w:rFonts w:ascii="Times New Roman" w:hAnsi="Times New Roman" w:cs="Times New Roman"/>
+              </w:rPr>
+              <w:t>Send manual saved-bracket notification.</w:t>
+            </w:r>
+          </w:p>
+        </w:tc>
+        <w:tc>
+          <w:tcPr>
+            <w:tcW w:w="3260" w:type="dxa"/>
+            <w:tcMar>
+              <w:top w:w="100" w:type="dxa"/>
+              <w:left w:w="120" w:type="dxa"/>
+              <w:bottom w:w="100" w:type="dxa"/>
+              <w:right w:w="120" w:type="dxa"/>
+            </w:tcMar>
+            <w:vAlign w:val="center"/>
+          </w:tcPr>
+          <w:p>
+            <w:pPr>
+              <w:spacing w:after="0"/>
+            </w:pPr>
+            <w:r>
+              <w:rPr>
+                <w:color w:val="auto"/>
+                <w:rFonts w:ascii="Times New Roman" w:hAnsi="Times New Roman" w:cs="Times New Roman"/>
+              </w:rPr>
+              <w:t>Body includes channels[] such as sms/email, audience, message. Local implementation stores notification event; production adapter sends SMS/email.</w:t>
+            </w:r>
+          </w:p>
+        </w:tc>
+      </w:tr>
+    </w:tbl>
+    <w:tbl>
+      <w:tblPr>
+        <w:tblW w:w="9360" w:type="dxa"/>
+        <w:tblInd w:w="120" w:type="dxa"/>
+        <w:tblLayout w:type="fixed"/>
+        <w:tblBorders>
+          <w:top w:val="single" w:sz="4" w:space="0" w:color="000000"/>
+          <w:left w:val="single" w:sz="4" w:space="0" w:color="000000"/>
+          <w:bottom w:val="single" w:sz="4" w:space="0" w:color="000000"/>
+          <w:right w:val="single" w:sz="4" w:space="0" w:color="000000"/>
+          <w:insideH w:val="single" w:sz="4" w:space="0" w:color="000000"/>
+          <w:insideV w:val="single" w:sz="4" w:space="0" w:color="000000"/>
+        </w:tblBorders>
+      </w:tblPr>
+      <w:tblGrid>
+        <w:gridCol w:w="9360"/>
+      </w:tblGrid>
+      <w:tr>
+        <w:tc>
+          <w:tcPr>
+            <w:tcW w:w="9360" w:type="dxa"/>
+            <w:tcMar>
+              <w:top w:w="160" w:type="dxa"/>
+              <w:left w:w="180" w:type="dxa"/>
+              <w:bottom w:w="140" w:type="dxa"/>
+              <w:right w:w="180" w:type="dxa"/>
+            </w:tcMar>
+            <w:shd w:fill="F4F6F9"/>
+          </w:tcPr>
+          <w:p>
+            <w:pPr>
+              <w:spacing w:after="80"/>
+            </w:pPr>
+            <w:r>
+              <w:rPr>
+                <w:b/>
+                <w:color w:val="auto"/>
+                <w:rFonts w:ascii="Times New Roman" w:hAnsi="Times New Roman" w:cs="Times New Roman"/>
+              </w:rPr>
+              <w:t>Bracket API Rendering Rule</w:t>
+            </w:r>
+          </w:p>
+          <w:p>
+            <w:pPr>
+              <w:spacing w:after="60"/>
+            </w:pPr>
+            <w:r>
+              <w:rPr>
+                <w:color w:val="auto"/>
+                <w:rFonts w:ascii="Times New Roman" w:hAnsi="Times New Roman" w:cs="Times New Roman"/>
+              </w:rPr>
+              <w:t>Public upcoming rounds must not expose manager controls, team bank, plus icons, or editable nodes. They render only round labels, blank circular slots, and clean connector lines until the manager publishes teams.</w:t>
+            </w:r>
+          </w:p>
+          <w:p>
+            <w:pPr>
+              <w:spacing w:after="60"/>
+            </w:pPr>
+            <w:r>
+              <w:rPr>
+                <w:color w:val="auto"/>
+                <w:rFonts w:ascii="Times New Roman" w:hAnsi="Times New Roman" w:cs="Times New Roman"/>
+              </w:rPr>
+              <w:t>Manager workspace can display accepted teams, editable circular nodes, add/remove actions, save button, winner advance, cancel/rematch, and manual notification controls.</w:t>
+            </w:r>
+          </w:p>
+        </w:tc>
+      </w:tr>
+    </w:tbl>
+    <w:p>
+      <w:pPr>
+        <w:pStyle w:val="Heading1"/>
+      </w:pPr>
+      <w:r>
+        <w:rPr>
+          <w:color w:val="auto"/>
+          <w:rFonts w:ascii="Times New Roman" w:hAnsi="Times New Roman" w:cs="Times New Roman"/>
+        </w:rPr>
+        <w:t>11. Socket.IO Event Contract</w:t>
       </w:r>
     </w:p>
     <w:tbl>
@@ -5366,7 +7070,7 @@
           <w:color w:val="auto"/>
           <w:rFonts w:ascii="Times New Roman" w:hAnsi="Times New Roman" w:cs="Times New Roman"/>
         </w:rPr>
-        <w:t>11. Webhook API Rules</w:t>
+        <w:t>12. Webhook API Rules</w:t>
       </w:r>
     </w:p>
     <w:p>
@@ -5453,7 +7157,7 @@
           <w:color w:val="auto"/>
           <w:rFonts w:ascii="Times New Roman" w:hAnsi="Times New Roman" w:cs="Times New Roman"/>
         </w:rPr>
-        <w:t>12. API Security Requirements</w:t>
+        <w:t>13. API Security Requirements</w:t>
       </w:r>
     </w:p>
     <w:tbl>
@@ -5897,7 +7601,7 @@
           <w:color w:val="auto"/>
           <w:rFonts w:ascii="Times New Roman" w:hAnsi="Times New Roman" w:cs="Times New Roman"/>
         </w:rPr>
-        <w:t>13. API Documentation Deliverables</w:t>
+        <w:t>14. API Documentation Deliverables</w:t>
       </w:r>
     </w:p>
     <w:p>
@@ -5984,7 +7688,7 @@
           <w:color w:val="auto"/>
           <w:rFonts w:ascii="Times New Roman" w:hAnsi="Times New Roman" w:cs="Times New Roman"/>
         </w:rPr>
-        <w:t>14. External API Source Reference</w:t>
+        <w:t>15. External API Source Reference</w:t>
       </w:r>
     </w:p>
     <w:tbl>
@@ -6768,6 +8472,106 @@
           </w:p>
         </w:tc>
       </w:tr>
+      <w:tr>
+        <w:tc>
+          <w:tcPr>
+            <w:tcW w:w="2600" w:type="dxa"/>
+            <w:tcMar>
+              <w:top w:w="100" w:type="dxa"/>
+              <w:left w:w="120" w:type="dxa"/>
+              <w:bottom w:w="100" w:type="dxa"/>
+              <w:right w:w="120" w:type="dxa"/>
+            </w:tcMar>
+            <w:vAlign w:val="center"/>
+          </w:tcPr>
+          <w:p>
+            <w:pPr>
+              <w:spacing w:after="0"/>
+            </w:pPr>
+            <w:r>
+              <w:rPr>
+                <w:color w:val="auto"/>
+                <w:rFonts w:ascii="Times New Roman" w:hAnsi="Times New Roman" w:cs="Times New Roman"/>
+              </w:rPr>
+              <w:t>Challonge Tournament Registration and Brackets</w:t>
+            </w:r>
+          </w:p>
+        </w:tc>
+        <w:tc>
+          <w:tcPr>
+            <w:tcW w:w="6760" w:type="dxa"/>
+            <w:tcMar>
+              <w:top w:w="100" w:type="dxa"/>
+              <w:left w:w="120" w:type="dxa"/>
+              <w:bottom w:w="100" w:type="dxa"/>
+              <w:right w:w="120" w:type="dxa"/>
+            </w:tcMar>
+            <w:vAlign w:val="center"/>
+          </w:tcPr>
+          <w:p>
+            <w:pPr>
+              <w:spacing w:after="0"/>
+            </w:pPr>
+            <w:r>
+              <w:rPr>
+                <w:color w:val="auto"/>
+                <w:rFonts w:ascii="Times New Roman" w:hAnsi="Times New Roman" w:cs="Times New Roman"/>
+              </w:rPr>
+              <w:t>https://challonge.com/features/tournaments and https://kb.challonge.com/en/article/hosting-a-sign-up-page-hsknjd/</w:t>
+            </w:r>
+          </w:p>
+        </w:tc>
+      </w:tr>
+      <w:tr>
+        <w:tc>
+          <w:tcPr>
+            <w:tcW w:w="2600" w:type="dxa"/>
+            <w:tcMar>
+              <w:top w:w="100" w:type="dxa"/>
+              <w:left w:w="120" w:type="dxa"/>
+              <w:bottom w:w="100" w:type="dxa"/>
+              <w:right w:w="120" w:type="dxa"/>
+            </w:tcMar>
+            <w:vAlign w:val="center"/>
+          </w:tcPr>
+          <w:p>
+            <w:pPr>
+              <w:spacing w:after="0"/>
+            </w:pPr>
+            <w:r>
+              <w:rPr>
+                <w:color w:val="auto"/>
+                <w:rFonts w:ascii="Times New Roman" w:hAnsi="Times New Roman" w:cs="Times New Roman"/>
+              </w:rPr>
+              <w:t>Toornament Organizer Bracket Formats</w:t>
+            </w:r>
+          </w:p>
+        </w:tc>
+        <w:tc>
+          <w:tcPr>
+            <w:tcW w:w="6760" w:type="dxa"/>
+            <w:tcMar>
+              <w:top w:w="100" w:type="dxa"/>
+              <w:left w:w="120" w:type="dxa"/>
+              <w:bottom w:w="100" w:type="dxa"/>
+              <w:right w:w="120" w:type="dxa"/>
+            </w:tcMar>
+            <w:vAlign w:val="center"/>
+          </w:tcPr>
+          <w:p>
+            <w:pPr>
+              <w:spacing w:after="0"/>
+            </w:pPr>
+            <w:r>
+              <w:rPr>
+                <w:color w:val="auto"/>
+                <w:rFonts w:ascii="Times New Roman" w:hAnsi="Times New Roman" w:cs="Times New Roman"/>
+              </w:rPr>
+              <w:t>https://www.toornament.com/en_US/organizer-software</w:t>
+            </w:r>
+          </w:p>
+        </w:tc>
+      </w:tr>
     </w:tbl>
     <w:p>
       <w:pPr>
@@ -6778,7 +8582,7 @@
           <w:color w:val="auto"/>
           <w:rFonts w:ascii="Times New Roman" w:hAnsi="Times New Roman" w:cs="Times New Roman"/>
         </w:rPr>
-        <w:t>15. AI Coding Instructions</w:t>
+        <w:t>16. AI Coding Instructions</w:t>
       </w:r>
     </w:p>
     <w:p>

</xml_diff>